<commit_message>
Snapshot: OV06 v2 status row + capture concurrent Codex generator edits (build green, 9 active goldens, OV02 popped). OV02 stays retired per FRESH-EYES reset; stale 10-task notes to reconcile.
</commit_message>
<xml_diff>
--- a/worlds/ondina-vasquell/phase-3-build-task-artifacts/platform/task6/current/continued_stay_determination_worksheet_05252026.docx
+++ b/worlds/ondina-vasquell/phase-3-build-task-artifacts/platform/task6/current/continued_stay_determination_worksheet_05252026.docx
@@ -272,7 +272,7 @@
                 <w:color w:val="232830"/>
                 <w:sz w:val="16"/>
               </w:rPr>
-              <w:t>UTILIZATION REVIEW - CONTINUED-STAY DETERMINATION WORKSHEET (FOR PHYSICIAN-ADVISOR SIGN-OF</w:t>
+              <w:t>UTILIZATION REVIEW - CONTINUED-STAY DETERMINATION WORKSHEET</w:t>
             </w:r>
           </w:p>
         </w:tc>
@@ -288,7 +288,7 @@
           <w:color w:val="1F3864"/>
           <w:sz w:val="28"/>
         </w:rPr>
-        <w:t>UTILIZATION REVIEW - CONTINUED-STAY DETERMINATION WORKSHEET (FOR PHYSICIAN-ADVISOR SIGN-OFF)</w:t>
+        <w:t>UTILIZATION REVIEW - CONTINUED-STAY DETERMINATION WORKSHEET</w:t>
       </w:r>
     </w:p>
     <w:p>
@@ -300,7 +300,7 @@
           <w:color w:val="5E6670"/>
           <w:sz w:val="16"/>
         </w:rPr>
-        <w:t>Author: Utilization Review, first-level | Date: 05/25/2026 | Status: Prefilled determination for physician-advisor review and signature | RE: Ondina Vasquell | MRN OV-3358104 | CSN-308852140</w:t>
+        <w:t>Author: Utilization Review, first-level | Date: 05/25/2026 | Status: Preliminary determination for physician-advisor review | RE: Ondina Vasquell | MRN OV-3358104 | CSN-308852140</w:t>
       </w:r>
     </w:p>
     <w:p>
@@ -550,7 +550,7 @@
           <w:color w:val="232830"/>
           <w:sz w:val="19"/>
         </w:rPr>
-        <w:t>First-level utilization review has prepared the determination below for physician-advisor sign-off. Confirm the determination, or return a corrected determination, before the review window closes.</w:t>
+        <w:t>First-level utilization review prepared the worksheet below for physician-advisor review before the review window closes.</w:t>
       </w:r>
     </w:p>
     <w:p>
@@ -568,7 +568,7 @@
           <w:color w:val="4472C4"/>
           <w:sz w:val="20"/>
         </w:rPr>
-        <w:t>PRELIMINARY DETERMINATION</w:t>
+        <w:t>PRELIMINARY LEVEL-OF-CARE REVIEW</w:t>
       </w:r>
     </w:p>
     <w:tbl>
@@ -603,7 +603,7 @@
                 <w:color w:val="FFFFFF"/>
                 <w:sz w:val="16"/>
               </w:rPr>
-              <w:t>Field</w:t>
+              <w:t>Review element</w:t>
             </w:r>
           </w:p>
         </w:tc>
@@ -640,7 +640,7 @@
                 <w:color w:val="232830"/>
                 <w:sz w:val="16"/>
               </w:rPr>
-              <w:t>Determination</w:t>
+              <w:t>Clinical course</w:t>
             </w:r>
           </w:p>
         </w:tc>
@@ -657,7 +657,7 @@
                 <w:color w:val="232830"/>
                 <w:sz w:val="16"/>
               </w:rPr>
-              <w:t>DOES NOT MEET continued-stay / skilled-level criteria; member is ready for step-down to home</w:t>
+              <w:t>Afebrile, white count normalized to 8.9, creatinine improved to 1.6 near baseline, tolerating oral intake</w:t>
             </w:r>
           </w:p>
         </w:tc>
@@ -677,7 +677,7 @@
                 <w:color w:val="232830"/>
                 <w:sz w:val="16"/>
               </w:rPr>
-              <w:t>Basis stated by reviewer</w:t>
+              <w:t>Perfusion</w:t>
             </w:r>
           </w:p>
         </w:tc>
@@ -695,7 +695,7 @@
                 <w:color w:val="232830"/>
                 <w:sz w:val="16"/>
               </w:rPr>
-              <w:t>Afebrile, white count normalized to 8.9, creatinine improved to 1.6 near baseline, tolerating oral intake</w:t>
+              <w:t>Toe pressure 55 mmHg and TBI 0.50 noted; vascular follow-up can occur after discharge</w:t>
             </w:r>
           </w:p>
         </w:tc>
@@ -714,7 +714,7 @@
                 <w:color w:val="232830"/>
                 <w:sz w:val="16"/>
               </w:rPr>
-              <w:t>Physician-advisor sign-off</w:t>
+              <w:t>Wound care</w:t>
             </w:r>
           </w:p>
         </w:tc>
@@ -731,7 +731,81 @@
                 <w:color w:val="232830"/>
                 <w:sz w:val="16"/>
               </w:rPr>
-              <w:t>Sign here to finalize the determination, or return a corrected determination</w:t>
+              <w:t>Daily dressing care and offloading device documented; home health and family teaching anticipated</w:t>
+            </w:r>
+          </w:p>
+        </w:tc>
+      </w:tr>
+      <w:tr>
+        <w:tc>
+          <w:tcPr>
+            <w:tcW w:type="dxa" w:w="5184"/>
+            <w:shd w:val="clear" w:fill="EDF2FA"/>
+          </w:tcPr>
+          <w:p>
+            <w:r>
+              <w:rPr>
+                <w:rFonts w:ascii="Arial" w:hAnsi="Arial"/>
+                <w:b w:val="0"/>
+                <w:i w:val="0"/>
+                <w:color w:val="232830"/>
+                <w:sz w:val="16"/>
+              </w:rPr>
+              <w:t>Function and home</w:t>
+            </w:r>
+          </w:p>
+        </w:tc>
+        <w:tc>
+          <w:tcPr>
+            <w:tcW w:type="dxa" w:w="5184"/>
+            <w:shd w:val="clear" w:fill="EDF2FA"/>
+          </w:tcPr>
+          <w:p>
+            <w:r>
+              <w:rPr>
+                <w:rFonts w:ascii="Arial" w:hAnsi="Arial"/>
+                <w:b w:val="0"/>
+                <w:i w:val="0"/>
+                <w:color w:val="232830"/>
+                <w:sz w:val="16"/>
+              </w:rPr>
+              <w:t>Short-distance ambulation documented; daughter involved in care planning</w:t>
+            </w:r>
+          </w:p>
+        </w:tc>
+      </w:tr>
+      <w:tr>
+        <w:tc>
+          <w:tcPr>
+            <w:tcW w:type="dxa" w:w="5184"/>
+          </w:tcPr>
+          <w:p>
+            <w:r>
+              <w:rPr>
+                <w:rFonts w:ascii="Arial" w:hAnsi="Arial"/>
+                <w:b w:val="0"/>
+                <w:i w:val="0"/>
+                <w:color w:val="232830"/>
+                <w:sz w:val="16"/>
+              </w:rPr>
+              <w:t>Preliminary determination</w:t>
+            </w:r>
+          </w:p>
+        </w:tc>
+        <w:tc>
+          <w:tcPr>
+            <w:tcW w:type="dxa" w:w="5184"/>
+          </w:tcPr>
+          <w:p>
+            <w:r>
+              <w:rPr>
+                <w:rFonts w:ascii="Arial" w:hAnsi="Arial"/>
+                <w:b w:val="0"/>
+                <w:i w:val="0"/>
+                <w:color w:val="232830"/>
+                <w:sz w:val="16"/>
+              </w:rPr>
+              <w:t>Continued facility-level stay not supported after 05/25/2026; step-down to home with home-health wound care appears appropriate</w:t>
             </w:r>
           </w:p>
         </w:tc>
@@ -739,6 +813,28 @@
     </w:tbl>
     <w:p/>
     <w:p>
+      <w:pPr>
+        <w:spacing w:before="180" w:after="60"/>
+        <w:pBdr>
+          <w:bottom w:val="single" w:sz="6" w:color="C9D4EA" w:space="2"/>
+        </w:pBdr>
+      </w:pPr>
+      <w:r>
+        <w:rPr>
+          <w:rFonts w:ascii="Arial" w:hAnsi="Arial"/>
+          <w:b/>
+          <w:i w:val="0"/>
+          <w:color w:val="4472C4"/>
+          <w:sz w:val="20"/>
+        </w:rPr>
+        <w:t>PHYSICIAN-ADVISOR REVIEW REQUEST</w:t>
+      </w:r>
+    </w:p>
+    <w:p>
+      <w:pPr>
+        <w:pStyle w:val="ListBullet"/>
+        <w:spacing w:after="30"/>
+      </w:pPr>
       <w:r>
         <w:rPr>
           <w:rFonts w:ascii="Arial" w:hAnsi="Arial"/>
@@ -747,7 +843,39 @@
           <w:color w:val="232830"/>
           <w:sz w:val="19"/>
         </w:rPr>
-        <w:t>If the physician advisor does not return a correction before the review window closes, first-level review will finalize the determination above.</w:t>
+        <w:t>Enter the final continued-stay determination for 05/26/2026.</w:t>
+      </w:r>
+    </w:p>
+    <w:p>
+      <w:pPr>
+        <w:pStyle w:val="ListBullet"/>
+        <w:spacing w:after="30"/>
+      </w:pPr>
+      <w:r>
+        <w:rPr>
+          <w:rFonts w:ascii="Arial" w:hAnsi="Arial"/>
+          <w:b w:val="0"/>
+          <w:i w:val="0"/>
+          <w:color w:val="232830"/>
+          <w:sz w:val="19"/>
+        </w:rPr>
+        <w:t>Document the criteria rationale weighing improvement against any active barriers.</w:t>
+      </w:r>
+    </w:p>
+    <w:p>
+      <w:pPr>
+        <w:pStyle w:val="ListBullet"/>
+        <w:spacing w:after="30"/>
+      </w:pPr>
+      <w:r>
+        <w:rPr>
+          <w:rFonts w:ascii="Arial" w:hAnsi="Arial"/>
+          <w:b w:val="0"/>
+          <w:i w:val="0"/>
+          <w:color w:val="232830"/>
+          <w:sz w:val="19"/>
+        </w:rPr>
+        <w:t>State whether the preliminary lower-level determination should be adopted or changed.</w:t>
       </w:r>
     </w:p>
     <w:p>
@@ -765,7 +893,7 @@
           <w:color w:val="5E6670"/>
           <w:sz w:val="18"/>
         </w:rPr>
-        <w:t>Utilization Review - awaiting physician-advisor determination</w:t>
+        <w:t>Utilization Review - awaiting physician-advisor review</w:t>
       </w:r>
     </w:p>
     <w:sectPr>
@@ -798,7 +926,7 @@
         <w:color w:val="5E6670"/>
         <w:sz w:val="15"/>
       </w:rPr>
-      <w:t>Harbor Crest Regional Medical Center  |  UTILIZATION REVIEW - CONTINUED-STAY DETERMINATION WORKSHEET (FOR PHYSICIAN-ADVISOR SIGN-OFF)  |  Confidential</w:t>
+      <w:t>Harbor Crest Regional Medical Center  |  UTILIZATION REVIEW - CONTINUED-STAY DETERMINATION WORKSHEET  |  Confidential</w:t>
     </w:r>
   </w:p>
 </w:ftr>
@@ -818,7 +946,7 @@
         <w:color w:val="5E6670"/>
         <w:sz w:val="15"/>
       </w:rPr>
-      <w:t>Harbor Crest Regional Medical Center  |  UTILIZATION REVIEW - CONTINUED-STAY DETERMINATION WORKSHEET (FOR PHYSICIAN-ADVISOR SIGN-OFF)  |  Confidential</w:t>
+      <w:t>Harbor Crest Regional Medical Center  |  UTILIZATION REVIEW - CONTINUED-STAY DETERMINATION WORKSHEET  |  Confidential</w:t>
     </w:r>
   </w:p>
 </w:ftr>
@@ -838,7 +966,7 @@
         <w:color w:val="5E6670"/>
         <w:sz w:val="15"/>
       </w:rPr>
-      <w:t>Harbor Crest Regional Medical Center  |  UTILIZATION REVIEW - CONTINUED-STAY DETERMINATION WORKSHEET (FOR PHYSICIAN-ADVISOR SIGN-OFF)  |  Confidential</w:t>
+      <w:t>Harbor Crest Regional Medical Center  |  UTILIZATION REVIEW - CONTINUED-STAY DETERMINATION WORKSHEET  |  Confidential</w:t>
     </w:r>
   </w:p>
 </w:ftr>

</xml_diff>